<commit_message>
Se realizan correciones en los documentos de evidencias
</commit_message>
<xml_diff>
--- a/Hoja_de_trabajo_III/Hoja de Trabajo 3 - Ciclos While y Do-While.docx
+++ b/Hoja_de_trabajo_III/Hoja de Trabajo 3 - Ciclos While y Do-While.docx
@@ -204,9 +204,13 @@
           <w:sz w:val="28"/>
           <w:szCs w:val="28"/>
         </w:rPr>
-        <w:t xml:space="preserve">Tarea </w:t>
-      </w:r>
-      <w:r>
+        <w:t>Hoja de Trabajo 3 - Ciclos While y Do-While</w:t>
+      </w:r>
+    </w:p>
+    <w:p>
+      <w:pPr>
+        <w:spacing w:line="276" w:lineRule="auto"/>
+        <w:jc w:val="center"/>
         <w:rPr>
           <w:rFonts w:ascii="Century Gothic" w:hAnsi="Century Gothic"/>
           <w:b/>
@@ -214,48 +218,7 @@
           <w:sz w:val="28"/>
           <w:szCs w:val="28"/>
         </w:rPr>
-        <w:t>V</w:t>
-      </w:r>
-      <w:r>
-        <w:rPr>
-          <w:rFonts w:ascii="Century Gothic" w:hAnsi="Century Gothic"/>
-          <w:b/>
-          <w:bCs/>
-          <w:sz w:val="28"/>
-          <w:szCs w:val="28"/>
-        </w:rPr>
-        <w:t xml:space="preserve"> - </w:t>
-      </w:r>
-      <w:r>
-        <w:rPr>
-          <w:rFonts w:ascii="Century Gothic" w:hAnsi="Century Gothic"/>
-          <w:b/>
-          <w:bCs/>
-          <w:sz w:val="28"/>
-          <w:szCs w:val="28"/>
-        </w:rPr>
-        <w:t xml:space="preserve">Estructuras de </w:t>
-      </w:r>
-      <w:r>
-        <w:rPr>
-          <w:rFonts w:ascii="Century Gothic" w:hAnsi="Century Gothic"/>
-          <w:b/>
-          <w:bCs/>
-          <w:sz w:val="28"/>
-          <w:szCs w:val="28"/>
-        </w:rPr>
-        <w:t>R</w:t>
-      </w:r>
-      <w:r>
-        <w:rPr>
-          <w:rFonts w:ascii="Century Gothic" w:hAnsi="Century Gothic"/>
-          <w:b/>
-          <w:bCs/>
-          <w:sz w:val="28"/>
-          <w:szCs w:val="28"/>
-        </w:rPr>
-        <w:t>epetición</w:t>
-      </w:r>
+      </w:pPr>
     </w:p>
     <w:p>
       <w:pPr>
@@ -263,12 +226,27 @@
         <w:jc w:val="center"/>
         <w:rPr>
           <w:rFonts w:ascii="Century Gothic" w:hAnsi="Century Gothic"/>
-          <w:b/>
-          <w:bCs/>
-          <w:sz w:val="28"/>
-          <w:szCs w:val="28"/>
-        </w:rPr>
-      </w:pPr>
+          <w:sz w:val="28"/>
+          <w:szCs w:val="28"/>
+        </w:rPr>
+      </w:pPr>
+      <w:r>
+        <w:rPr>
+          <w:rFonts w:ascii="Century Gothic" w:hAnsi="Century Gothic"/>
+          <w:sz w:val="28"/>
+          <w:szCs w:val="28"/>
+        </w:rPr>
+        <w:t xml:space="preserve">José Daniel Real García </w:t>
+      </w:r>
+      <w:r>
+        <w:rPr>
+          <w:rFonts w:ascii="Century Gothic" w:hAnsi="Century Gothic"/>
+          <w:sz w:val="28"/>
+          <w:szCs w:val="28"/>
+        </w:rPr>
+        <w:tab/>
+        <w:t xml:space="preserve">9941-25-837 </w:t>
+      </w:r>
     </w:p>
     <w:p>
       <w:pPr>
@@ -280,23 +258,6 @@
           <w:szCs w:val="28"/>
         </w:rPr>
       </w:pPr>
-      <w:r>
-        <w:rPr>
-          <w:rFonts w:ascii="Century Gothic" w:hAnsi="Century Gothic"/>
-          <w:sz w:val="28"/>
-          <w:szCs w:val="28"/>
-        </w:rPr>
-        <w:t xml:space="preserve">José Daniel Real García </w:t>
-      </w:r>
-      <w:r>
-        <w:rPr>
-          <w:rFonts w:ascii="Century Gothic" w:hAnsi="Century Gothic"/>
-          <w:sz w:val="28"/>
-          <w:szCs w:val="28"/>
-        </w:rPr>
-        <w:tab/>
-        <w:t xml:space="preserve">9941-25-837 </w:t>
-      </w:r>
     </w:p>
     <w:p>
       <w:pPr>
@@ -308,6 +269,14 @@
           <w:szCs w:val="28"/>
         </w:rPr>
       </w:pPr>
+      <w:r>
+        <w:rPr>
+          <w:rFonts w:ascii="Century Gothic" w:hAnsi="Century Gothic"/>
+          <w:sz w:val="28"/>
+          <w:szCs w:val="28"/>
+        </w:rPr>
+        <w:t xml:space="preserve">Plan Fin de Semana </w:t>
+      </w:r>
     </w:p>
     <w:p>
       <w:pPr>
@@ -325,7 +294,7 @@
           <w:sz w:val="28"/>
           <w:szCs w:val="28"/>
         </w:rPr>
-        <w:t xml:space="preserve">Plan Fin de Semana </w:t>
+        <w:t xml:space="preserve">Sección “A” </w:t>
       </w:r>
     </w:p>
     <w:p>
@@ -344,34 +313,7 @@
           <w:sz w:val="28"/>
           <w:szCs w:val="28"/>
         </w:rPr>
-        <w:t xml:space="preserve">Sección “A” </w:t>
-      </w:r>
-    </w:p>
-    <w:p>
-      <w:pPr>
-        <w:spacing w:line="276" w:lineRule="auto"/>
-        <w:jc w:val="center"/>
-        <w:rPr>
-          <w:rFonts w:ascii="Century Gothic" w:hAnsi="Century Gothic"/>
-          <w:sz w:val="28"/>
-          <w:szCs w:val="28"/>
-        </w:rPr>
-      </w:pPr>
-      <w:r>
-        <w:rPr>
-          <w:rFonts w:ascii="Century Gothic" w:hAnsi="Century Gothic"/>
-          <w:sz w:val="28"/>
-          <w:szCs w:val="28"/>
-        </w:rPr>
-        <w:t>22</w:t>
-      </w:r>
-      <w:r>
-        <w:rPr>
-          <w:rFonts w:ascii="Century Gothic" w:hAnsi="Century Gothic"/>
-          <w:sz w:val="28"/>
-          <w:szCs w:val="28"/>
-        </w:rPr>
-        <w:t xml:space="preserve"> de marzo del 2026</w:t>
+        <w:t>22 de marzo del 2026</w:t>
       </w:r>
     </w:p>
     <w:p>
@@ -404,6 +346,9 @@
     </w:p>
     <w:p>
       <w:r>
+        <w:rPr>
+          <w:noProof/>
+        </w:rPr>
         <w:drawing>
           <wp:inline distT="0" distB="0" distL="0" distR="0" wp14:anchorId="5E4CE0CB" wp14:editId="5DA74087">
             <wp:extent cx="5918316" cy="3333750"/>
@@ -452,6 +397,9 @@
     </w:p>
     <w:p>
       <w:r>
+        <w:rPr>
+          <w:noProof/>
+        </w:rPr>
         <w:drawing>
           <wp:inline distT="0" distB="0" distL="0" distR="0" wp14:anchorId="5027FFAF" wp14:editId="7BE77BB4">
             <wp:extent cx="5918200" cy="3409423"/>
@@ -501,6 +449,9 @@
     </w:p>
     <w:p>
       <w:r>
+        <w:rPr>
+          <w:noProof/>
+        </w:rPr>
         <w:drawing>
           <wp:inline distT="0" distB="0" distL="0" distR="0" wp14:anchorId="43D92097" wp14:editId="48F0C8B2">
             <wp:extent cx="6076950" cy="3504495"/>
@@ -549,6 +500,9 @@
     </w:p>
     <w:p>
       <w:r>
+        <w:rPr>
+          <w:noProof/>
+        </w:rPr>
         <w:drawing>
           <wp:inline distT="0" distB="0" distL="0" distR="0" wp14:anchorId="781AB055" wp14:editId="4CDCBA7B">
             <wp:extent cx="6076950" cy="3482189"/>
@@ -597,6 +551,9 @@
     </w:p>
     <w:p>
       <w:r>
+        <w:rPr>
+          <w:noProof/>
+        </w:rPr>
         <w:drawing>
           <wp:inline distT="0" distB="0" distL="0" distR="0" wp14:anchorId="6CC580B7" wp14:editId="33C55D5E">
             <wp:extent cx="6010275" cy="3435635"/>
@@ -645,6 +602,9 @@
     </w:p>
     <w:p>
       <w:r>
+        <w:rPr>
+          <w:noProof/>
+        </w:rPr>
         <w:drawing>
           <wp:inline distT="0" distB="0" distL="0" distR="0" wp14:anchorId="1ADC7782" wp14:editId="450A62A4">
             <wp:extent cx="6058849" cy="3476625"/>

</xml_diff>